<commit_message>
Reverify D5 instrument inventory evidence
</commit_message>
<xml_diff>
--- a/Project 1 Data Quality Assessment/D5 Topological Role Consistency and Structural Representativeness/outputs/reports/D5_EXPERT_REPORT_v2.3.docx
+++ b/Project 1 Data Quality Assessment/D5 Topological Role Consistency and Structural Representativeness/outputs/reports/D5_EXPERT_REPORT_v2.3.docx
@@ -70,7 +70,7 @@
           <w:color w:val="25282A"/>
           <w:sz w:val="19"/>
         </w:rPr>
-        <w:t>D5-LOCAL-20260726T101447Z</w:t>
+        <w:t>D5-LOCAL-20260727T034533Z</w:t>
       </w:r>
     </w:p>
     <w:p>
@@ -2474,7 +2474,7 @@
         <w:color w:val="5F6B73"/>
         <w:sz w:val="16"/>
       </w:rPr>
-      <w:t>Generated 2026-07-26 19:11 CST | Scientific aggregation release; automated deployment blocked</w:t>
+      <w:t>Generated 2026-07-27 12:26 CST | Scientific aggregation release; automated deployment blocked</w:t>
     </w:r>
   </w:p>
 </w:ftr>

</xml_diff>